<commit_message>
docs(manual): add Key Transpose to Basic Operation (JP + EN)
New paragraph in section 3 covering the header-bar Key Transpose stepper
(+-24 semitones, preserved across preset Load, < > buttons or F3/F4).
PDFs still need re-exporting from Word.

Co-Authored-By: Claude Sonnet 5 <noreply@anthropic.com>
</commit_message>
<xml_diff>
--- a/manual/FirstSynth User Manual.docx
+++ b/manual/FirstSynth User Manual.docx
@@ -320,6 +320,17 @@
           <w:sz w:val="21"/>
         </w:rPr>
         <w:t>In Standalone, you can play notes from your computer keyboard even without a MIDI keyboard (starting at the A key, with white and black keys alternating). Use Z/X to shift the octave down/up.</w:t>
+      </w:r>
+    </w:p>
+    <w:p>
+      <w:pPr>
+        <w:spacing w:after="120"/>
+      </w:pPr>
+      <w:r>
+        <w:rPr>
+          <w:sz w:val="21"/>
+        </w:rPr>
+        <w:t>The preset bar in the header also has a global Key Transpose stepper ‹ 0 ›. It shifts everything you play by up to ±24 semitones, and it is kept when you switch presets. Adjust it with the ‹ › buttons or the F3 / F4 keys on your computer keyboard.</w:t>
       </w:r>
     </w:p>
     <w:p>

</xml_diff>

<commit_message>
docs(manual): refresh all 4 UI screenshots for v1.0.0
New Synth/Effects/Matrix/Looper captures (Bend Range + Osc Drift knobs,
Key Transpose stepper, thicker knob pointers, current preset bar). Embedded
images in both docx swapped and their extents re-fitted to the new aspect
ratio. JP manual keeps the user's edit to the Key Transpose wording.
PDFs re-exported locally (gitignored).

Co-Authored-By: Claude Sonnet 5 <noreply@anthropic.com>
</commit_message>
<xml_diff>
--- a/manual/FirstSynth User Manual.docx
+++ b/manual/FirstSynth User Manual.docx
@@ -356,7 +356,7 @@
       <w:r>
         <w:drawing>
           <wp:inline xmlns:a="http://schemas.openxmlformats.org/drawingml/2006/main" xmlns:pic="http://schemas.openxmlformats.org/drawingml/2006/picture">
-            <wp:extent cx="5580000" cy="3071634"/>
+            <wp:extent cx="5580000" cy="3452751"/>
             <wp:docPr id="1" name="Picture 1"/>
             <wp:cNvGraphicFramePr>
               <a:graphicFrameLocks noChangeAspect="1"/>
@@ -377,7 +377,7 @@
                   <pic:spPr>
                     <a:xfrm>
                       <a:off x="0" y="0"/>
-                      <a:ext cx="5580000" cy="3071634"/>
+                      <a:ext cx="5580000" cy="3452751"/>
                     </a:xfrm>
                     <a:prstGeom prst="rect"/>
                   </pic:spPr>
@@ -656,7 +656,7 @@
       <w:r>
         <w:drawing>
           <wp:inline xmlns:a="http://schemas.openxmlformats.org/drawingml/2006/main" xmlns:pic="http://schemas.openxmlformats.org/drawingml/2006/picture">
-            <wp:extent cx="5580000" cy="3048408"/>
+            <wp:extent cx="5580000" cy="3432606"/>
             <wp:docPr id="2" name="Picture 2"/>
             <wp:cNvGraphicFramePr>
               <a:graphicFrameLocks noChangeAspect="1"/>
@@ -677,7 +677,7 @@
                   <pic:spPr>
                     <a:xfrm>
                       <a:off x="0" y="0"/>
-                      <a:ext cx="5580000" cy="3048408"/>
+                      <a:ext cx="5580000" cy="3432606"/>
                     </a:xfrm>
                     <a:prstGeom prst="rect"/>
                   </pic:spPr>
@@ -803,7 +803,7 @@
       <w:r>
         <w:drawing>
           <wp:inline xmlns:a="http://schemas.openxmlformats.org/drawingml/2006/main" xmlns:pic="http://schemas.openxmlformats.org/drawingml/2006/picture">
-            <wp:extent cx="5580000" cy="3179349"/>
+            <wp:extent cx="5580000" cy="3431983"/>
             <wp:docPr id="3" name="Picture 3"/>
             <wp:cNvGraphicFramePr>
               <a:graphicFrameLocks noChangeAspect="1"/>
@@ -824,7 +824,7 @@
                   <pic:spPr>
                     <a:xfrm>
                       <a:off x="0" y="0"/>
-                      <a:ext cx="5580000" cy="3179349"/>
+                      <a:ext cx="5580000" cy="3431983"/>
                     </a:xfrm>
                     <a:prstGeom prst="rect"/>
                   </pic:spPr>
@@ -927,7 +927,7 @@
       <w:r>
         <w:drawing>
           <wp:inline xmlns:a="http://schemas.openxmlformats.org/drawingml/2006/main" xmlns:pic="http://schemas.openxmlformats.org/drawingml/2006/picture">
-            <wp:extent cx="5580000" cy="3126898"/>
+            <wp:extent cx="5580000" cy="3424826"/>
             <wp:docPr id="4" name="Picture 4"/>
             <wp:cNvGraphicFramePr>
               <a:graphicFrameLocks noChangeAspect="1"/>
@@ -948,7 +948,7 @@
                   <pic:spPr>
                     <a:xfrm>
                       <a:off x="0" y="0"/>
-                      <a:ext cx="5580000" cy="3126898"/>
+                      <a:ext cx="5580000" cy="3424826"/>
                     </a:xfrm>
                     <a:prstGeom prst="rect"/>
                   </pic:spPr>

</xml_diff>